<commit_message>
docs: provide public dataset link in final writeup
</commit_message>
<xml_diff>
--- a/review_outputs/2026-10-15/final_submission/Smart_Parking_Final_Report.docx
+++ b/review_outputs/2026-10-15/final_submission/Smart_Parking_Final_Report.docx
@@ -2461,7 +2461,7 @@
     </w:p>
     <w:p>
       <w:r>
-        <w:t xml:space="preserve">Dataset files and metadata are in review_outputs/2026-10-15/dataset. The dataset ZIP is shared read-only within the vit.ac.in domain: </w:t>
+        <w:t xml:space="preserve">Dataset files and metadata are in review_outputs/2026-10-15/dataset. A public, version-pinned ZIP download is available from GitHub: </w:t>
       </w:r>
       <w:hyperlink r:id="rId14">
         <w:r>
@@ -6123,11 +6123,22 @@
     </w:p>
     <w:p>
       <w:r>
-        <w:t>The privacy-safe simulated dataset archive is shared with read access restricted to the vit.ac.in Google Workspace domain. It is not a public link. The archive contains parking_raw.csv, parking_features.csv, dataset_metadata.json, and dataset documentation.</w:t>
+        <w:t>The privacy-safe simulated dataset archive is publicly downloadable from the project's GitHub repository. The version-pinned ZIP contains parking_raw.csv, parking_features.csv, dataset_metadata.json, and dataset documentation. A Google Drive mirror is also provided, but its current permission is restricted to the vit.ac.in Google Workspace domain; use the public GitHub link if you do not have VIT access.</w:t>
       </w:r>
     </w:p>
     <w:p>
       <w:hyperlink r:id="rId14">
+        <w:r>
+          <w:rPr>
+            <w:color w:val="0563C1"/>
+            <w:u w:val="single"/>
+          </w:rPr>
+          <w:t>Public dataset ZIP (GitHub)</w:t>
+        </w:r>
+      </w:hyperlink>
+    </w:p>
+    <w:p>
+      <w:hyperlink r:id="rId29">
         <w:r>
           <w:rPr>
             <w:color w:val="0563C1"/>
@@ -6138,7 +6149,7 @@
       </w:hyperlink>
     </w:p>
     <w:p>
-      <w:hyperlink r:id="rId29">
+      <w:hyperlink r:id="rId30">
         <w:r>
           <w:rPr>
             <w:color w:val="0563C1"/>

</xml_diff>